<commit_message>
Project done, added a README
</commit_message>
<xml_diff>
--- a/output/documents/orientation_project_2_workshop_4.docx
+++ b/output/documents/orientation_project_2_workshop_4.docx
@@ -20,16 +20,14 @@
         <w:rPr/>
       </w:pPr>
       <w:r>
-        <w:rPr>
-          <w:i/>
-          <w:sz w:val="18"/>
-        </w:rPr>
-        <w:t>LO1 orientation     |     Four technical workshops and one Topic Market</w:t>
+        <w:rPr/>
+        <w:t>LO1 orientation     |     Six technical workshops and one Topic Market</w:t>
       </w:r>
     </w:p>
     <w:p>
       <w:pPr>
         <w:pStyle w:val="Heading1"/>
+        <w:keepNext w:val="true"/>
         <w:rPr/>
       </w:pPr>
       <w:r>
@@ -60,21 +58,13 @@
       </w:pPr>
       <w:r>
         <w:rPr/>
-      </w:r>
-    </w:p>
-    <w:p>
-      <w:pPr>
-        <w:pStyle w:val="Normal"/>
-        <w:rPr/>
-      </w:pPr>
-      <w:r>
-        <w:rPr/>
         <w:t>My preferred topic remains clear, but I am less certain about whether a future master’s degree at a research university or a university of applied sciences would suit my goals.</w:t>
       </w:r>
     </w:p>
     <w:p>
       <w:pPr>
         <w:pStyle w:val="Heading1"/>
+        <w:keepNext w:val="true"/>
         <w:rPr/>
       </w:pPr>
       <w:r>
@@ -95,6 +85,7 @@
     <w:p>
       <w:pPr>
         <w:pStyle w:val="Heading1"/>
+        <w:keepNext w:val="true"/>
         <w:rPr/>
       </w:pPr>
       <w:bookmarkStart w:id="0" w:name="topic_overview"/>
@@ -284,14 +275,16 @@
           <w:p>
             <w:pPr>
               <w:pStyle w:val="Normal"/>
-              <w:spacing w:before="0" w:after="60"/>
+              <w:widowControl/>
+              <w:suppressAutoHyphens w:val="true"/>
+              <w:bidi w:val="0"/>
+              <w:spacing w:lineRule="auto" w:line="259" w:before="0" w:after="140"/>
+              <w:jc w:val="start"/>
               <w:rPr/>
             </w:pPr>
             <w:r>
-              <w:rPr>
-                <w:sz w:val="19"/>
-              </w:rPr>
-              <w:t>C experience helped with Python basics; data structures revealed a need for more practice.</w:t>
+              <w:rPr/>
+              <w:t>C experience transferred to Python conditions and loops; saved exercises show lists, sets and JSON API access.</w:t>
             </w:r>
           </w:p>
         </w:tc>
@@ -554,6 +547,91 @@
           </w:p>
         </w:tc>
       </w:tr>
+      <w:tr>
+        <w:trPr/>
+        <w:tc>
+          <w:tcPr>
+            <w:tcW w:w="2952" w:type="dxa"/>
+            <w:tcBorders>
+              <w:start w:val="single" w:sz="4" w:space="0" w:color="D9D9D9"/>
+              <w:bottom w:val="single" w:sz="4" w:space="0" w:color="D9D9D9"/>
+              <w:end w:val="single" w:sz="4" w:space="0" w:color="D9D9D9"/>
+            </w:tcBorders>
+            <w:shd w:fill="FFFFFF" w:val="clear"/>
+            <w:vAlign w:val="center"/>
+          </w:tcPr>
+          <w:p>
+            <w:pPr>
+              <w:pStyle w:val="Normal"/>
+              <w:spacing w:before="0" w:after="60"/>
+              <w:rPr/>
+            </w:pPr>
+            <w:hyperlink w:anchor="_toc30">
+              <w:r>
+                <w:rPr>
+                  <w:rStyle w:val="Hyperlink"/>
+                  <w:color w:val="235B76"/>
+                  <w:sz w:val="19"/>
+                  <w:u w:val="single"/>
+                </w:rPr>
+                <w:t>Smart Industry</w:t>
+              </w:r>
+            </w:hyperlink>
+          </w:p>
+        </w:tc>
+        <w:tc>
+          <w:tcPr>
+            <w:tcW w:w="2088" w:type="dxa"/>
+            <w:tcBorders>
+              <w:start w:val="single" w:sz="4" w:space="0" w:color="D9D9D9"/>
+              <w:bottom w:val="single" w:sz="4" w:space="0" w:color="D9D9D9"/>
+              <w:end w:val="single" w:sz="4" w:space="0" w:color="D9D9D9"/>
+            </w:tcBorders>
+            <w:shd w:fill="FFFFFF" w:val="clear"/>
+            <w:vAlign w:val="center"/>
+          </w:tcPr>
+          <w:p>
+            <w:pPr>
+              <w:pStyle w:val="Normal"/>
+              <w:spacing w:before="0" w:after="60"/>
+              <w:rPr/>
+            </w:pPr>
+            <w:r>
+              <w:rPr>
+                <w:sz w:val="19"/>
+              </w:rPr>
+              <w:t>1 technical workshop</w:t>
+            </w:r>
+          </w:p>
+        </w:tc>
+        <w:tc>
+          <w:tcPr>
+            <w:tcW w:w="4853" w:type="dxa"/>
+            <w:tcBorders>
+              <w:start w:val="single" w:sz="4" w:space="0" w:color="D9D9D9"/>
+              <w:bottom w:val="single" w:sz="4" w:space="0" w:color="D9D9D9"/>
+              <w:end w:val="single" w:sz="4" w:space="0" w:color="D9D9D9"/>
+            </w:tcBorders>
+            <w:shd w:fill="FFFFFF" w:val="clear"/>
+            <w:vAlign w:val="center"/>
+          </w:tcPr>
+          <w:p>
+            <w:pPr>
+              <w:pStyle w:val="Normal"/>
+              <w:spacing w:before="0" w:after="60"/>
+              <w:rPr>
+                <w:sz w:val="19"/>
+              </w:rPr>
+            </w:pPr>
+            <w:r>
+              <w:rPr>
+                <w:sz w:val="19"/>
+              </w:rPr>
+              <w:t>Introduction to Node-RED and connecting components through flows; identified possible uses for processing and displaying greenhouse sensor data.</w:t>
+            </w:r>
+          </w:p>
+        </w:tc>
+      </w:tr>
     </w:tbl>
     <w:p>
       <w:pPr>
@@ -562,11 +640,8 @@
         <w:rPr/>
       </w:pPr>
       <w:r>
-        <w:rPr>
-          <w:i/>
-          <w:sz w:val="18"/>
-        </w:rPr>
-        <w:t>Select a topic in the table to jump to its section. Supporting evidence can be added to each entry.</w:t>
+        <w:rPr/>
+        <w:t>Select a topic in the table to jump to its section. The Python sections include screenshot placeholders for supporting evidence.</w:t>
       </w:r>
     </w:p>
     <w:p>
@@ -584,6 +659,7 @@
     <w:p>
       <w:pPr>
         <w:pStyle w:val="Heading1"/>
+        <w:keepNext w:val="true"/>
         <w:spacing w:before="0" w:after="140"/>
         <w:rPr/>
       </w:pPr>
@@ -597,6 +673,7 @@
     <w:p>
       <w:pPr>
         <w:pStyle w:val="Heading2"/>
+        <w:keepNext w:val="true"/>
         <w:rPr/>
       </w:pPr>
       <w:r>
@@ -610,16 +687,14 @@
         <w:rPr/>
       </w:pPr>
       <w:r>
-        <w:rPr>
-          <w:i/>
-          <w:sz w:val="18"/>
-        </w:rPr>
-        <w:t xml:space="preserve">Date: 29.09.2026     |     Evidence: </w:t>
+        <w:rPr/>
+        <w:t>Date: 29.09.2026     |     Evidence: ws_one.py</w:t>
       </w:r>
     </w:p>
     <w:p>
       <w:pPr>
         <w:pStyle w:val="Heading3"/>
+        <w:keepNext w:val="true"/>
         <w:rPr/>
       </w:pPr>
       <w:r>
@@ -634,12 +709,13 @@
       </w:pPr>
       <w:r>
         <w:rPr/>
-        <w:t>In the first Python workshop, I learned the basic syntax and solved programming problems. I had little difficulty with the exercises because I had solved similar problems before in C. The problem-solving approach was familiar, while the way of expressing the solution in Python was new to me.</w:t>
+        <w:t>In the first Python workshop, I practised input, conditions and loops. In ws_one.py, lines 4–16 classify a temperature using if, elif and else. Lines 46–61 contain a number-guessing exercise that repeats until the guess matches and gives higher or lower hints. I had solved similar problems in C, so the logic was familiar while the Python syntax was new to me.</w:t>
       </w:r>
     </w:p>
     <w:p>
       <w:pPr>
         <w:pStyle w:val="Heading3"/>
+        <w:keepNext w:val="true"/>
         <w:rPr/>
       </w:pPr>
       <w:r>
@@ -654,7 +730,7 @@
       </w:pPr>
       <w:r>
         <w:rPr/>
-        <w:t>This showed me that some of my existing programming knowledge transfers to another language. However, being able to solve familiar exercises does not yet show that I am confident with Python as a whole. The workshop gave me a starting point for learning the language and a way to build on my previous experience.</w:t>
+        <w:t>These exercises show how my experience with conditions and loops in C transfers to Python. The temperature example also connects to my interest in embedded systems, where readings need to be compared with thresholds. My saved exercises are inside a triple-quoted block, so they record the code I wrote but do not demonstrate a successful run of the current file.</w:t>
       </w:r>
     </w:p>
     <w:p>
@@ -678,7 +754,159 @@
     </w:p>
     <w:p>
       <w:pPr>
+        <w:pStyle w:val="Normal"/>
+        <w:spacing w:before="160" w:after="160"/>
+        <w:rPr>
+          <w:i/>
+          <w:sz w:val="20"/>
+        </w:rPr>
+      </w:pPr>
+      <w:r>
+        <w:drawing>
+          <wp:anchor distT="0" distB="0" distL="0" distR="0" simplePos="0" relativeHeight="2" behindDoc="0" locked="0" layoutInCell="0" allowOverlap="1">
+            <wp:simplePos x="0" y="0"/>
+            <wp:positionH relativeFrom="column">
+              <wp:align>center</wp:align>
+            </wp:positionH>
+            <wp:positionV relativeFrom="paragraph">
+              <wp:posOffset>635</wp:posOffset>
+            </wp:positionV>
+            <wp:extent cx="6280150" cy="2713990"/>
+            <wp:effectExtent l="0" t="0" r="0" b="0"/>
+            <wp:wrapSquare wrapText="largest"/>
+            <wp:docPr id="1" name="Image1"/>
+            <wp:cNvGraphicFramePr>
+              <a:graphicFrameLocks xmlns:a="http://schemas.openxmlformats.org/drawingml/2006/main" noChangeAspect="1"/>
+            </wp:cNvGraphicFramePr>
+            <a:graphic xmlns:a="http://schemas.openxmlformats.org/drawingml/2006/main">
+              <a:graphicData uri="http://schemas.openxmlformats.org/drawingml/2006/picture">
+                <pic:pic xmlns:pic="http://schemas.openxmlformats.org/drawingml/2006/picture">
+                  <pic:nvPicPr>
+                    <pic:cNvPr id="1" name="Image1"/>
+                    <pic:cNvPicPr>
+                      <a:picLocks noChangeAspect="1" noChangeArrowheads="1"/>
+                    </pic:cNvPicPr>
+                  </pic:nvPicPr>
+                  <pic:blipFill>
+                    <a:blip r:embed="rId2"/>
+                    <a:stretch>
+                      <a:fillRect/>
+                    </a:stretch>
+                  </pic:blipFill>
+                  <pic:spPr bwMode="auto">
+                    <a:xfrm>
+                      <a:off x="0" y="0"/>
+                      <a:ext cx="6280150" cy="2713990"/>
+                    </a:xfrm>
+                    <a:prstGeom prst="rect">
+                      <a:avLst/>
+                    </a:prstGeom>
+                    <a:noFill/>
+                  </pic:spPr>
+                </pic:pic>
+              </a:graphicData>
+            </a:graphic>
+          </wp:anchor>
+        </w:drawing>
+      </w:r>
+      <w:r>
+        <w:rPr>
+          <w:i/>
+          <w:sz w:val="20"/>
+        </w:rPr>
+        <w:t>Temperature classification using Python conditions</w:t>
+      </w:r>
+    </w:p>
+    <w:p>
+      <w:pPr>
+        <w:pStyle w:val="Normal"/>
+        <w:spacing w:before="160" w:after="160"/>
+        <w:rPr>
+          <w:i/>
+          <w:sz w:val="20"/>
+        </w:rPr>
+      </w:pPr>
+      <w:r>
+        <w:rPr>
+          <w:i/>
+          <w:sz w:val="20"/>
+        </w:rPr>
+        <w:t>and</w:t>
+      </w:r>
+    </w:p>
+    <w:p>
+      <w:pPr>
+        <w:pStyle w:val="Normal"/>
+        <w:spacing w:before="160" w:after="160"/>
+        <w:rPr>
+          <w:i/>
+          <w:sz w:val="20"/>
+        </w:rPr>
+      </w:pPr>
+      <w:r>
+        <w:drawing>
+          <wp:anchor distT="0" distB="0" distL="0" distR="0" simplePos="0" relativeHeight="3" behindDoc="0" locked="0" layoutInCell="0" allowOverlap="1">
+            <wp:simplePos x="0" y="0"/>
+            <wp:positionH relativeFrom="column">
+              <wp:posOffset>26670</wp:posOffset>
+            </wp:positionH>
+            <wp:positionV relativeFrom="paragraph">
+              <wp:posOffset>177165</wp:posOffset>
+            </wp:positionV>
+            <wp:extent cx="4523740" cy="1888490"/>
+            <wp:effectExtent l="0" t="0" r="0" b="0"/>
+            <wp:wrapSquare wrapText="largest"/>
+            <wp:docPr id="2" name="Image2"/>
+            <wp:cNvGraphicFramePr>
+              <a:graphicFrameLocks xmlns:a="http://schemas.openxmlformats.org/drawingml/2006/main" noChangeAspect="1"/>
+            </wp:cNvGraphicFramePr>
+            <a:graphic xmlns:a="http://schemas.openxmlformats.org/drawingml/2006/main">
+              <a:graphicData uri="http://schemas.openxmlformats.org/drawingml/2006/picture">
+                <pic:pic xmlns:pic="http://schemas.openxmlformats.org/drawingml/2006/picture">
+                  <pic:nvPicPr>
+                    <pic:cNvPr id="2" name="Image2"/>
+                    <pic:cNvPicPr>
+                      <a:picLocks noChangeAspect="1" noChangeArrowheads="1"/>
+                    </pic:cNvPicPr>
+                  </pic:nvPicPr>
+                  <pic:blipFill>
+                    <a:blip r:embed="rId3"/>
+                    <a:stretch>
+                      <a:fillRect/>
+                    </a:stretch>
+                  </pic:blipFill>
+                  <pic:spPr bwMode="auto">
+                    <a:xfrm>
+                      <a:off x="0" y="0"/>
+                      <a:ext cx="4523740" cy="1888490"/>
+                    </a:xfrm>
+                    <a:prstGeom prst="rect">
+                      <a:avLst/>
+                    </a:prstGeom>
+                    <a:noFill/>
+                  </pic:spPr>
+                </pic:pic>
+              </a:graphicData>
+            </a:graphic>
+          </wp:anchor>
+        </w:drawing>
+      </w:r>
+      <w:r>
+        <w:rPr>
+          <w:i/>
+          <w:sz w:val="20"/>
+        </w:rPr>
+        <w:t>number-guessing loop</w:t>
+      </w:r>
+      <w:r>
+        <w:br w:type="page"/>
+      </w:r>
+    </w:p>
+    <w:p>
+      <w:pPr>
         <w:pStyle w:val="Heading2"/>
+        <w:keepNext w:val="true"/>
+        <w:spacing w:before="0" w:after="140"/>
         <w:rPr/>
       </w:pPr>
       <w:r>
@@ -692,16 +920,14 @@
         <w:rPr/>
       </w:pPr>
       <w:r>
-        <w:rPr>
-          <w:i/>
-          <w:sz w:val="18"/>
-        </w:rPr>
-        <w:t xml:space="preserve">Date: 06.10.2026     |    </w:t>
+        <w:rPr/>
+        <w:t>Date: 06.10.2026     |     Evidence: ws_two.py</w:t>
       </w:r>
     </w:p>
     <w:p>
       <w:pPr>
         <w:pStyle w:val="Heading3"/>
+        <w:keepNext w:val="true"/>
         <w:rPr/>
       </w:pPr>
       <w:r>
@@ -716,23 +942,13 @@
       </w:pPr>
       <w:r>
         <w:rPr/>
-        <w:t xml:space="preserve">The second workshop continued the Python course and </w:t>
-      </w:r>
-      <w:r>
-        <w:rPr>
-          <w:b/>
-          <w:bCs/>
-        </w:rPr>
-        <w:t>introduced lists, tuples, dictionaries and sets</w:t>
-      </w:r>
-      <w:r>
-        <w:rPr/>
-        <w:t>. I found the exercises more difficult this time because working with these structures was less intuitive for me. I cannot yet say that I can use all four confidently.</w:t>
+        <w:t>The second workshop introduced lists, tuples, dictionaries and sets. My saved exercises show practical work with lists and sets: lines 14–30 collect guesses in a list using append(), while lines 78–97 keep correct and incorrect letter guesses in separate sets. I found these structures less intuitive than the first workshop’s conditions and loops. This file does not demonstrate completed tuple or dictionary exercises.</w:t>
       </w:r>
     </w:p>
     <w:p>
       <w:pPr>
         <w:pStyle w:val="Heading3"/>
+        <w:keepNext w:val="true"/>
         <w:rPr/>
       </w:pPr>
       <w:r>
@@ -747,42 +963,164 @@
       </w:pPr>
       <w:r>
         <w:rPr/>
-        <w:t xml:space="preserve">Compared with the first session, this workshop exposed a gap in my understanding. </w:t>
+        <w:t>The two guessing exercises give me a concrete comparison: a list records the sequence of guesses, including repeats, while sets keep distinct guessed letters. In the letter game, the condition compares the correct guesses with the distinct letters in the word. This helps me explain why the data structure should match the information I need to keep.</w:t>
+      </w:r>
+    </w:p>
+    <w:p>
+      <w:pPr>
+        <w:pStyle w:val="Normal"/>
+        <w:rPr/>
+      </w:pPr>
+      <w:r>
+        <w:rPr/>
+        <w:t>I still need to practise choosing structures independently. A useful next step is to run the exercises separately and test repeated guesses. The saved exercises are inside a triple-quoted block; in addition, Exercise 3 assigns values to sum and max, which would interfere with later calls to the built-in functions if the exercises were run together unchanged.</w:t>
+      </w:r>
+    </w:p>
+    <w:p>
+      <w:pPr>
+        <w:pStyle w:val="Normal"/>
+        <w:rPr/>
+      </w:pPr>
+      <w:r>
+        <w:rPr/>
+      </w:r>
+    </w:p>
+    <w:p>
+      <w:pPr>
+        <w:pStyle w:val="Normal"/>
+        <w:spacing w:before="160" w:after="160"/>
+        <w:rPr>
+          <w:i/>
+          <w:sz w:val="20"/>
+        </w:rPr>
+      </w:pPr>
+      <w:r>
+        <w:drawing>
+          <wp:anchor distT="0" distB="0" distL="0" distR="0" simplePos="0" relativeHeight="4" behindDoc="0" locked="0" layoutInCell="0" allowOverlap="1">
+            <wp:simplePos x="0" y="0"/>
+            <wp:positionH relativeFrom="column">
+              <wp:align>center</wp:align>
+            </wp:positionH>
+            <wp:positionV relativeFrom="paragraph">
+              <wp:posOffset>635</wp:posOffset>
+            </wp:positionV>
+            <wp:extent cx="6280150" cy="2773045"/>
+            <wp:effectExtent l="0" t="0" r="0" b="0"/>
+            <wp:wrapSquare wrapText="largest"/>
+            <wp:docPr id="3" name="Image3"/>
+            <wp:cNvGraphicFramePr>
+              <a:graphicFrameLocks xmlns:a="http://schemas.openxmlformats.org/drawingml/2006/main" noChangeAspect="1"/>
+            </wp:cNvGraphicFramePr>
+            <a:graphic xmlns:a="http://schemas.openxmlformats.org/drawingml/2006/main">
+              <a:graphicData uri="http://schemas.openxmlformats.org/drawingml/2006/picture">
+                <pic:pic xmlns:pic="http://schemas.openxmlformats.org/drawingml/2006/picture">
+                  <pic:nvPicPr>
+                    <pic:cNvPr id="3" name="Image3"/>
+                    <pic:cNvPicPr>
+                      <a:picLocks noChangeAspect="1" noChangeArrowheads="1"/>
+                    </pic:cNvPicPr>
+                  </pic:nvPicPr>
+                  <pic:blipFill>
+                    <a:blip r:embed="rId4"/>
+                    <a:stretch>
+                      <a:fillRect/>
+                    </a:stretch>
+                  </pic:blipFill>
+                  <pic:spPr bwMode="auto">
+                    <a:xfrm>
+                      <a:off x="0" y="0"/>
+                      <a:ext cx="6280150" cy="2773045"/>
+                    </a:xfrm>
+                    <a:prstGeom prst="rect">
+                      <a:avLst/>
+                    </a:prstGeom>
+                    <a:noFill/>
+                  </pic:spPr>
+                </pic:pic>
+              </a:graphicData>
+            </a:graphic>
+          </wp:anchor>
+        </w:drawing>
+        <w:drawing>
+          <wp:anchor distT="0" distB="0" distL="0" distR="0" simplePos="0" relativeHeight="5" behindDoc="0" locked="0" layoutInCell="0" allowOverlap="1">
+            <wp:simplePos x="0" y="0"/>
+            <wp:positionH relativeFrom="column">
+              <wp:posOffset>0</wp:posOffset>
+            </wp:positionH>
+            <wp:positionV relativeFrom="paragraph">
+              <wp:posOffset>2979420</wp:posOffset>
+            </wp:positionV>
+            <wp:extent cx="6280150" cy="2381250"/>
+            <wp:effectExtent l="0" t="0" r="0" b="0"/>
+            <wp:wrapSquare wrapText="bothSides"/>
+            <wp:docPr id="4" name="Image4"/>
+            <wp:cNvGraphicFramePr>
+              <a:graphicFrameLocks xmlns:a="http://schemas.openxmlformats.org/drawingml/2006/main" noChangeAspect="1"/>
+            </wp:cNvGraphicFramePr>
+            <a:graphic xmlns:a="http://schemas.openxmlformats.org/drawingml/2006/main">
+              <a:graphicData uri="http://schemas.openxmlformats.org/drawingml/2006/picture">
+                <pic:pic xmlns:pic="http://schemas.openxmlformats.org/drawingml/2006/picture">
+                  <pic:nvPicPr>
+                    <pic:cNvPr id="4" name="Image4"/>
+                    <pic:cNvPicPr>
+                      <a:picLocks noChangeAspect="1" noChangeArrowheads="1"/>
+                    </pic:cNvPicPr>
+                  </pic:nvPicPr>
+                  <pic:blipFill>
+                    <a:blip r:embed="rId5"/>
+                    <a:stretch>
+                      <a:fillRect/>
+                    </a:stretch>
+                  </pic:blipFill>
+                  <pic:spPr bwMode="auto">
+                    <a:xfrm>
+                      <a:off x="0" y="0"/>
+                      <a:ext cx="6280150" cy="2381250"/>
+                    </a:xfrm>
+                    <a:prstGeom prst="rect">
+                      <a:avLst/>
+                    </a:prstGeom>
+                    <a:noFill/>
+                  </pic:spPr>
+                </pic:pic>
+              </a:graphicData>
+            </a:graphic>
+          </wp:anchor>
+        </w:drawing>
       </w:r>
       <w:r>
         <w:rPr>
-          <w:b/>
-          <w:bCs/>
+          <w:i/>
+          <w:sz w:val="20"/>
         </w:rPr>
-        <w:t>Familiarity with programming problems in C did not make every part of Python straightforward.</w:t>
-      </w:r>
-      <w:r>
-        <w:rPr/>
-        <w:t xml:space="preserve"> I now need to practise how the different structures behave and how to choose one for a particular problem.</w:t>
+        <w:t>Recording guesses in a list</w:t>
       </w:r>
     </w:p>
     <w:p>
       <w:pPr>
         <w:pStyle w:val="Normal"/>
-        <w:rPr/>
+        <w:spacing w:before="160" w:after="160"/>
+        <w:rPr>
+          <w:i/>
+          <w:sz w:val="20"/>
+        </w:rPr>
       </w:pPr>
       <w:r>
-        <w:rPr/>
-        <w:t>This difficulty gives me a more realistic view of my current skills. It does not by itself tell me whether a study direction suits me, but it identifies something I need to learn. The useful next step is to record exactly where I struggled and whether practice helps me overcome it.</w:t>
+        <w:rPr>
+          <w:i/>
+          <w:sz w:val="20"/>
+        </w:rPr>
+        <w:t>Tracking distinct letters with sets</w:t>
+      </w:r>
+      <w:r>
+        <w:br w:type="page"/>
       </w:r>
     </w:p>
     <w:p>
       <w:pPr>
-        <w:pStyle w:val="Heading3"/>
-        <w:rPr/>
-      </w:pPr>
-      <w:r>
-        <w:rPr/>
-      </w:r>
-    </w:p>
-    <w:p>
-      <w:pPr>
         <w:pStyle w:val="Heading2"/>
+        <w:keepNext w:val="true"/>
+        <w:spacing w:before="0" w:after="140"/>
         <w:rPr/>
       </w:pPr>
       <w:r>
@@ -796,16 +1134,14 @@
         <w:rPr/>
       </w:pPr>
       <w:r>
-        <w:rPr>
-          <w:i/>
-          <w:sz w:val="18"/>
-        </w:rPr>
-        <w:t xml:space="preserve">Date: 13.10.2026     |    </w:t>
+        <w:rPr/>
+        <w:t xml:space="preserve">Date: 13.10.2026 </w:t>
       </w:r>
     </w:p>
     <w:p>
       <w:pPr>
         <w:pStyle w:val="Heading3"/>
+        <w:keepNext w:val="true"/>
         <w:rPr/>
       </w:pPr>
       <w:r>
@@ -833,6 +1169,7 @@
     <w:p>
       <w:pPr>
         <w:pStyle w:val="Heading3"/>
+        <w:keepNext w:val="true"/>
         <w:rPr/>
       </w:pPr>
       <w:r>
@@ -857,25 +1194,23 @@
       </w:pPr>
       <w:r>
         <w:rPr/>
-        <w:t>These topics also relate to my interest in embedded programming and my project. I need to have a more modular system, so that when something goes wrong, the rest of the system still works.</w:t>
+        <w:t>These topics also relate to my embedded project. Separating responsibilities into modules would make faults easier to locate. I also need explicit error handling so that a failure in one part does not unnecessarily stop other functions.</w:t>
       </w:r>
     </w:p>
     <w:p>
       <w:pPr>
-        <w:pStyle w:val="Normal"/>
-        <w:rPr/>
+        <w:pStyle w:val="Heading2"/>
+        <w:keepNext w:val="true"/>
+        <w:rPr>
+          <w:i/>
+          <w:sz w:val="20"/>
+        </w:rPr>
       </w:pPr>
       <w:r>
-        <w:rPr/>
-      </w:r>
-    </w:p>
-    <w:p>
-      <w:pPr>
-        <w:pStyle w:val="Normal"/>
-        <w:rPr/>
-      </w:pPr>
-      <w:r>
-        <w:rPr/>
+        <w:rPr>
+          <w:i/>
+          <w:sz w:val="20"/>
+        </w:rPr>
       </w:r>
     </w:p>
     <w:p>
@@ -894,16 +1229,14 @@
         <w:rPr/>
       </w:pPr>
       <w:r>
-        <w:rPr>
-          <w:i/>
-          <w:sz w:val="18"/>
-        </w:rPr>
-        <w:t>Date: 27.10.2026</w:t>
+        <w:rPr/>
+        <w:t>Date: 27.10.2026     |     Evidence: ws_four.py</w:t>
       </w:r>
     </w:p>
     <w:p>
       <w:pPr>
         <w:pStyle w:val="Heading3"/>
+        <w:keepNext w:val="true"/>
         <w:rPr/>
       </w:pPr>
       <w:r>
@@ -918,20 +1251,13 @@
       </w:pPr>
       <w:r>
         <w:rPr/>
-        <w:t>The fourth workshop focused on working with data in Python and keeping it available after a program stops. It introduced different ways of storing data, including files, relational databases, NoSQL databases and vector databases. The demonstrations covered reading and saving data in JSON files, working with DuckDB and using ChromaDB for vector data.</w:t>
-      </w:r>
-      <w:r>
-        <w:rPr/>
-        <w:t>I did similar things with C but t</w:t>
-      </w:r>
-      <w:r>
-        <w:rPr/>
-        <w:t>his gave me an overview of how Python can work with stored information and how the storage method relates to the way the data is organised and used.</w:t>
+        <w:t>The fourth workshop introduced ways of storing data, including files, relational databases, NoSQL databases and vector databases. The demonstrations covered JSON files, DuckDB and ChromaDB. My saved exercise in ws_four.py focuses on retrieving JSON from an API: it requests Pikachu data from PokéAPI, parses the response with json.load(), then prints the name and each ability. This is evidence of reading structured data; the script does not save a file or use a database.</w:t>
       </w:r>
     </w:p>
     <w:p>
       <w:pPr>
         <w:pStyle w:val="Heading3"/>
+        <w:keepNext w:val="true"/>
         <w:rPr/>
       </w:pPr>
       <w:r>
@@ -946,7 +1272,7 @@
       </w:pPr>
       <w:r>
         <w:rPr/>
-        <w:t>Compared with the previous workshops, this session moved beyond the structure of the program itself to what happens to its data. I can connect this to embedded systems, where sensor measurements may need to be saved and reviewed later. For my greenhouse project, storing measurements could help me compare conditions over time instead of only looking at the current values.</w:t>
+        <w:t>The exercise helped me connect a JSON response to Python dictionaries and lists. The name is read by its key, while a loop goes through the abilities list and accesses a nested name. This is relevant to embedded systems because sensor messages can also contain structured fields that another program needs to read.</w:t>
       </w:r>
     </w:p>
     <w:p>
@@ -956,42 +1282,65 @@
       </w:pPr>
       <w:r>
         <w:rPr/>
-        <w:t>The workshop gives me another example of how Software Engineering skills can support my interest in Intelligent Technologies. An introduction to several storage methods is a starting point, but choosing one for a project requires a clearer understanding of what the system needs. A useful next step would be to save a small set of sensor readings to a JSON file and read them back in Python. This would help me apply the topic to something related to my own project.</w:t>
+        <w:t xml:space="preserve">The workshop showed me another way Software Engineering skills can support Intelligent Technologies. My next step is to save a small set of sensor readings to a JSON file and read them back in Python, extending the exercise from retrieving data to keeping it after the program stops. I also need to handle </w:t>
+      </w:r>
+      <w:r>
+        <w:drawing>
+          <wp:anchor distT="0" distB="0" distL="0" distR="0" simplePos="0" relativeHeight="6" behindDoc="0" locked="0" layoutInCell="0" allowOverlap="1">
+            <wp:simplePos x="0" y="0"/>
+            <wp:positionH relativeFrom="column">
+              <wp:posOffset>10160</wp:posOffset>
+            </wp:positionH>
+            <wp:positionV relativeFrom="paragraph">
+              <wp:posOffset>805180</wp:posOffset>
+            </wp:positionV>
+            <wp:extent cx="6280150" cy="2430145"/>
+            <wp:effectExtent l="0" t="0" r="0" b="0"/>
+            <wp:wrapSquare wrapText="largest"/>
+            <wp:docPr id="5" name="Image5"/>
+            <wp:cNvGraphicFramePr>
+              <a:graphicFrameLocks xmlns:a="http://schemas.openxmlformats.org/drawingml/2006/main" noChangeAspect="1"/>
+            </wp:cNvGraphicFramePr>
+            <a:graphic xmlns:a="http://schemas.openxmlformats.org/drawingml/2006/main">
+              <a:graphicData uri="http://schemas.openxmlformats.org/drawingml/2006/picture">
+                <pic:pic xmlns:pic="http://schemas.openxmlformats.org/drawingml/2006/picture">
+                  <pic:nvPicPr>
+                    <pic:cNvPr id="5" name="Image5"/>
+                    <pic:cNvPicPr>
+                      <a:picLocks noChangeAspect="1" noChangeArrowheads="1"/>
+                    </pic:cNvPicPr>
+                  </pic:nvPicPr>
+                  <pic:blipFill>
+                    <a:blip r:embed="rId6"/>
+                    <a:stretch>
+                      <a:fillRect/>
+                    </a:stretch>
+                  </pic:blipFill>
+                  <pic:spPr bwMode="auto">
+                    <a:xfrm>
+                      <a:off x="0" y="0"/>
+                      <a:ext cx="6280150" cy="2430145"/>
+                    </a:xfrm>
+                    <a:prstGeom prst="rect">
+                      <a:avLst/>
+                    </a:prstGeom>
+                    <a:noFill/>
+                  </pic:spPr>
+                </pic:pic>
+              </a:graphicData>
+            </a:graphic>
+          </wp:anchor>
+        </w:drawing>
+      </w:r>
+      <w:r>
+        <w:rPr/>
+        <w:t>request failures and missing fields rather than assuming that every response has the expected structure.</w:t>
       </w:r>
     </w:p>
     <w:p>
       <w:pPr>
         <w:pStyle w:val="Heading1"/>
-        <w:spacing w:before="0" w:after="140"/>
-        <w:rPr/>
-      </w:pPr>
-      <w:r>
-        <w:rPr/>
-      </w:r>
-    </w:p>
-    <w:p>
-      <w:pPr>
-        <w:pStyle w:val="Normal"/>
-        <w:spacing w:before="0" w:after="140"/>
-        <w:rPr/>
-      </w:pPr>
-      <w:r>
-        <w:rPr/>
-      </w:r>
-    </w:p>
-    <w:p>
-      <w:pPr>
-        <w:pStyle w:val="Normal"/>
-        <w:spacing w:before="0" w:after="140"/>
-        <w:rPr/>
-      </w:pPr>
-      <w:r>
-        <w:rPr/>
-      </w:r>
-    </w:p>
-    <w:p>
-      <w:pPr>
-        <w:pStyle w:val="Heading1"/>
+        <w:keepNext w:val="true"/>
         <w:spacing w:before="0" w:after="140"/>
         <w:rPr/>
       </w:pPr>
@@ -1018,6 +1367,7 @@
     <w:p>
       <w:pPr>
         <w:pStyle w:val="Heading2"/>
+        <w:keepNext w:val="true"/>
         <w:rPr/>
       </w:pPr>
       <w:r>
@@ -1059,6 +1409,7 @@
     <w:p>
       <w:pPr>
         <w:pStyle w:val="Heading2"/>
+        <w:keepNext w:val="true"/>
         <w:rPr/>
       </w:pPr>
       <w:r>
@@ -1079,26 +1430,7 @@
     <w:p>
       <w:pPr>
         <w:pStyle w:val="Heading1"/>
-        <w:spacing w:before="0" w:after="140"/>
-        <w:rPr/>
-      </w:pPr>
-      <w:r>
-        <w:rPr/>
-      </w:r>
-    </w:p>
-    <w:p>
-      <w:pPr>
-        <w:pStyle w:val="Heading1"/>
-        <w:spacing w:before="0" w:after="140"/>
-        <w:rPr/>
-      </w:pPr>
-      <w:r>
-        <w:rPr/>
-      </w:r>
-    </w:p>
-    <w:p>
-      <w:pPr>
-        <w:pStyle w:val="Heading1"/>
+        <w:keepNext w:val="true"/>
         <w:spacing w:before="0" w:after="140"/>
         <w:rPr/>
       </w:pPr>
@@ -1125,6 +1457,7 @@
     <w:p>
       <w:pPr>
         <w:pStyle w:val="Heading2"/>
+        <w:keepNext w:val="true"/>
         <w:rPr/>
       </w:pPr>
       <w:r>
@@ -1145,6 +1478,7 @@
     <w:p>
       <w:pPr>
         <w:pStyle w:val="Heading2"/>
+        <w:keepNext w:val="true"/>
         <w:rPr/>
       </w:pPr>
       <w:r>
@@ -1175,6 +1509,7 @@
     <w:p>
       <w:pPr>
         <w:pStyle w:val="Heading2"/>
+        <w:keepNext w:val="true"/>
         <w:rPr/>
       </w:pPr>
       <w:r>
@@ -1205,6 +1540,7 @@
     <w:p>
       <w:pPr>
         <w:pStyle w:val="Heading1"/>
+        <w:keepNext w:val="true"/>
         <w:spacing w:before="0" w:after="140"/>
         <w:rPr/>
       </w:pPr>
@@ -1218,6 +1554,7 @@
     <w:p>
       <w:pPr>
         <w:pStyle w:val="Heading1"/>
+        <w:keepNext w:val="true"/>
         <w:spacing w:before="0" w:after="140"/>
         <w:rPr/>
       </w:pPr>
@@ -1244,6 +1581,7 @@
     <w:p>
       <w:pPr>
         <w:pStyle w:val="Heading2"/>
+        <w:keepNext w:val="true"/>
         <w:rPr/>
       </w:pPr>
       <w:r>
@@ -1284,6 +1622,7 @@
     <w:p>
       <w:pPr>
         <w:pStyle w:val="Heading2"/>
+        <w:keepNext w:val="true"/>
         <w:rPr/>
       </w:pPr>
       <w:r>
@@ -1332,17 +1671,145 @@
     <w:p>
       <w:pPr>
         <w:pStyle w:val="Heading1"/>
-        <w:spacing w:before="0" w:after="140"/>
-        <w:rPr/>
-      </w:pPr>
+        <w:spacing w:before="0" w:after="0"/>
+        <w:rPr>
+          <w:vanish/>
+          <w:specVanish/>
+        </w:rPr>
+      </w:pPr>
+      <w:bookmarkStart w:id="5" w:name="_toc30"/>
+      <w:bookmarkEnd w:id="5"/>
       <w:r>
-        <w:rPr/>
-        <w:t>Current conclusion and next steps*</w:t>
+        <w:rPr>
+          <w:rStyle w:val="Strong"/>
+          <w:b/>
+          <w:bCs/>
+        </w:rPr>
+        <w:t>Smart Industry</w:t>
       </w:r>
     </w:p>
     <w:p>
       <w:pPr>
+        <w:pStyle w:val="BodyText"/>
+        <w:spacing w:before="0" w:after="140"/>
+        <w:rPr/>
+      </w:pPr>
+      <w:r/>
+      <w:r>
+        <w:rPr>
+          <w:rStyle w:val="Strong"/>
+        </w:rPr>
+      </w:r>
+      <w:r>
+        <w:rPr/>
+        <w:br/>
+      </w:r>
+      <w:r>
+        <w:rPr>
+          <w:rStyle w:val="Emphasis"/>
+        </w:rPr>
+        <w:t xml:space="preserve">Technical workshop | Date: </w:t>
+      </w:r>
+      <w:r>
+        <w:rPr>
+          <w:rStyle w:val="Emphasis"/>
+        </w:rPr>
+        <w:t>08.10.2026</w:t>
+      </w:r>
+    </w:p>
+    <w:p>
+      <w:pPr>
+        <w:pStyle w:val="BodyText"/>
+        <w:spacing w:before="0" w:after="140"/>
+        <w:rPr/>
+      </w:pPr>
+      <w:r>
+        <w:rPr>
+          <w:rStyle w:val="Strong"/>
+        </w:rPr>
+        <w:t>What I did and learned</w:t>
+      </w:r>
+    </w:p>
+    <w:p>
+      <w:pPr>
+        <w:pStyle w:val="BodyText"/>
+        <w:spacing w:before="0" w:after="140"/>
+        <w:rPr/>
+      </w:pPr>
+      <w:r>
+        <w:rPr/>
+        <w:t>In this workshop, I was introduced to Node-RED and how it can connect different components in an industrial process. The examples showed how to build flows using connected blocks, pass messages between them and check the output using debug nodes. The workshop also covered function blocks with JavaScript and an example of retrieving weather data through an API and using a switch to separate temperature values.</w:t>
+      </w:r>
+    </w:p>
+    <w:p>
+      <w:pPr>
+        <w:pStyle w:val="BodyText"/>
+        <w:spacing w:before="0" w:after="140"/>
+        <w:rPr/>
+      </w:pPr>
+      <w:r>
+        <w:rPr>
+          <w:rStyle w:val="Strong"/>
+        </w:rPr>
+        <w:t>How this influenced my thinking</w:t>
+      </w:r>
+    </w:p>
+    <w:p>
+      <w:pPr>
+        <w:pStyle w:val="BodyText"/>
+        <w:spacing w:before="0" w:after="140"/>
+        <w:rPr/>
+      </w:pPr>
+      <w:r>
+        <w:rPr/>
+        <w:t>This workshop gave me a more practical picture of Smart Industry. I can connect the flow-based approach to my greenhouse project, where sensor data needs to be processed and used to decide how the system should respond. It also showed me how existing components and services can be connected to build a working application.</w:t>
+      </w:r>
+    </w:p>
+    <w:p>
+      <w:pPr>
+        <w:pStyle w:val="BodyText"/>
+        <w:spacing w:before="0" w:after="140"/>
+        <w:rPr/>
+      </w:pPr>
+      <w:r>
+        <w:rPr/>
+        <w:t>Intelligent Technologies remains my preferred direction because of my interest in embedded programming and hardware. However, Node-RED gives me a tool to explore when connecting my system to other services or displaying its measurements. A useful next step would be to create a small flow that receives a temperature value and shows whether it is above or below a chosen limit.</w:t>
+      </w:r>
+    </w:p>
+    <w:p>
+      <w:pPr>
+        <w:pStyle w:val="Normal"/>
+        <w:rPr/>
+      </w:pPr>
+      <w:r>
+        <w:rPr/>
+      </w:r>
+    </w:p>
+    <w:p>
+      <w:pPr>
+        <w:pStyle w:val="Normal"/>
+        <w:rPr/>
+      </w:pPr>
+      <w:r>
+        <w:rPr/>
+      </w:r>
+    </w:p>
+    <w:p>
+      <w:pPr>
+        <w:pStyle w:val="Heading1"/>
+        <w:keepNext w:val="true"/>
+        <w:spacing w:before="0" w:after="140"/>
+        <w:rPr/>
+      </w:pPr>
+      <w:r>
+        <w:rPr/>
+        <w:t>Current conclusion and next steps</w:t>
+      </w:r>
+    </w:p>
+    <w:p>
+      <w:pPr>
         <w:pStyle w:val="Heading2"/>
+        <w:keepNext w:val="true"/>
         <w:rPr/>
       </w:pPr>
       <w:r>
@@ -1357,7 +1824,7 @@
       </w:pPr>
       <w:r>
         <w:rPr/>
-        <w:t>Intelligent Technologies remains my preferred Semester 2 choice for a coupe of concrete reasons. These build on my Project 1 reflections and are being tested through the activities in Project 2.</w:t>
+        <w:t>Intelligent Technologies remains my preferred Semester 2 choice for several concrete reasons. These build on my Project 1 reflections and are being tested through the activities in Project 2.</w:t>
       </w:r>
     </w:p>
     <w:p>
@@ -1431,9 +1898,9 @@
       </w:r>
     </w:p>
     <w:sectPr>
-      <w:footerReference w:type="even" r:id="rId2"/>
-      <w:footerReference w:type="default" r:id="rId3"/>
-      <w:footerReference w:type="first" r:id="rId4"/>
+      <w:footerReference w:type="even" r:id="rId7"/>
+      <w:footerReference w:type="default" r:id="rId8"/>
+      <w:footerReference w:type="first" r:id="rId9"/>
       <w:type w:val="nextPage"/>
       <w:pgSz w:w="11906" w:h="16838"/>
       <w:pgMar w:left="1008" w:right="1008" w:gutter="0" w:header="0" w:top="936" w:footer="720" w:bottom="936"/>
@@ -1488,7 +1955,7 @@
     </w:r>
     <w:r>
       <w:rPr/>
-      <w:t>5</w:t>
+      <w:t>7</w:t>
     </w:r>
     <w:r>
       <w:rPr/>
@@ -1526,7 +1993,7 @@
     </w:r>
     <w:r>
       <w:rPr/>
-      <w:t>5</w:t>
+      <w:t>7</w:t>
     </w:r>
     <w:r>
       <w:rPr/>
@@ -3614,6 +4081,36 @@
       <w:outlineLvl w:val="9"/>
     </w:pPr>
     <w:rPr/>
+  </w:style>
+  <w:style w:type="paragraph" w:styleId="FrameContents">
+    <w:name w:val="Frame Contents"/>
+    <w:basedOn w:val="Normal"/>
+    <w:qFormat/>
+    <w:pPr/>
+    <w:rPr/>
+  </w:style>
+  <w:style w:type="paragraph" w:styleId="TableContents">
+    <w:name w:val="Table Contents"/>
+    <w:basedOn w:val="Normal"/>
+    <w:qFormat/>
+    <w:pPr>
+      <w:widowControl w:val="false"/>
+      <w:suppressLineNumbers/>
+    </w:pPr>
+    <w:rPr/>
+  </w:style>
+  <w:style w:type="paragraph" w:styleId="TableHeading">
+    <w:name w:val="Table Heading"/>
+    <w:basedOn w:val="TableContents"/>
+    <w:qFormat/>
+    <w:pPr>
+      <w:suppressLineNumbers/>
+      <w:jc w:val="center"/>
+    </w:pPr>
+    <w:rPr>
+      <w:b/>
+      <w:bCs/>
+    </w:rPr>
   </w:style>
   <w:style w:type="numbering" w:styleId="NoList" w:default="1">
     <w:name w:val="No List"/>

</xml_diff>